<commit_message>
fix(translation): exhaustive pronoun, tone, and dialogue harmonization across all volumes and formats
</commit_message>
<xml_diff>
--- a/Vol9_VI_corrected.docx
+++ b/Vol9_VI_corrected.docx
@@ -1005,7 +1005,7 @@
           <w:color w:val="222222"/>
           <w:sz w:val="24"/>
         </w:rPr>
-        <w:t>Dù chuyện này chẳng có gì mới mẻ, nhưng việc phải trực tiếp đối mặt với những lời trêu chọc của Itsuki mang đến một cảm giác xấu hổ mãnh liệt hơn cả những gì Amane tưởng tượng, khiến lông mày cậu vô thức nhíu lại. “Đừng có nói nghe mờ ám như vậy. Bọn tao chỉ tổ chức ăn mừng như bình thường thôi.”</w:t>
+        <w:t>Dù chuyện này chẳng có gì mới mẻ, nhưng việc phải trực tiếp đối mặt với những lời trêu chọc của Itsuki mang đến một cảm giác xấu hổ mãnh liệt hơn cả những gì Amane tưởng tượng, khiến lông mày cậu vô thức nhíu lại. “Đừng có nói nghe mờ ám như vậy. Bọn tớ chỉ tổ chức ăn mừng như bình thường thôi.”</w:t>
       </w:r>
     </w:p>
     <w:p>
@@ -10718,7 +10718,7 @@
           <w:color w:val="222222"/>
           <w:sz w:val="24"/>
         </w:rPr>
-        <w:t>“Nếu vậy thì cậu có giống cô Koyuki không?”</w:t>
+        <w:t>“Nếu vậy thì cậu có giống bác Koyuki không?”</w:t>
       </w:r>
     </w:p>
     <w:p>
@@ -10744,20 +10744,20 @@
           <w:color w:val="222222"/>
           <w:sz w:val="24"/>
         </w:rPr>
-        <w:t>“Ừ. Sau tất cả những gì cậu kể, tớ bỗng tự hỏi không biết cậu có giống cô Koyuki không.”</w:t>
-      </w:r>
-    </w:p>
-    <w:p>
-      <w:pPr>
-        <w:spacing w:before="0" w:after="120" w:line="276" w:lineRule="auto"/>
-      </w:pPr>
-      <w:r>
-        <w:rPr>
-          <w:rFonts w:ascii="Montserrat" w:hAnsi="Montserrat"/>
-          <w:color w:val="222222"/>
-          <w:sz w:val="24"/>
-        </w:rPr>
-        <w:t>Tính cách và hành vi có thể do di truyền quyết định, hoặc bị ảnh hưởng bởi những người thân thiết xung quanh. Tuy không rõ trường hợp của Mahiru là do đâu, nhưng chắc chắn cô không hề giống mẹ mình, và qua những gì Amane được nghe thì cô có vẻ cũng chẳng giống cha. Do đó, sẽ chẳng có gì đáng ngạc nhiên nếu cho rằng cô giống Koyuki, người hẳn đã có tác động rất lớn đến quá trình phát triển tính cách của cô. “T-Tớ cũng không rõ nữa… Ừm, đúng là cô Koyuki đã dạy tớ rất nhiều điều, nên xét ở góc độ đó thì có lẽ bọn tớ khá giống nhau… nhưng chuyện này cũng không thể chắc chắn được cho đến khi cậu tự mình tận mắt thấy…”</w:t>
+        <w:t>“Ừ. Sau tất cả những gì cậu kể, tớ bỗng tự hỏi không biết cậu có giống bác Koyuki không.”</w:t>
+      </w:r>
+    </w:p>
+    <w:p>
+      <w:pPr>
+        <w:spacing w:before="0" w:after="120" w:line="276" w:lineRule="auto"/>
+      </w:pPr>
+      <w:r>
+        <w:rPr>
+          <w:rFonts w:ascii="Montserrat" w:hAnsi="Montserrat"/>
+          <w:color w:val="222222"/>
+          <w:sz w:val="24"/>
+        </w:rPr>
+        <w:t>Tính cách và hành vi có thể do di truyền quyết định, hoặc bị ảnh hưởng bởi những người thân thiết xung quanh. Tuy không rõ trường hợp của Mahiru là do đâu, nhưng chắc chắn cô không hề giống mẹ mình, và qua những gì Amane được nghe thì cô có vẻ cũng chẳng giống cha. Do đó, sẽ chẳng có gì đáng ngạc nhiên nếu cho rằng cô giống Koyuki, người hẳn đã có tác động rất lớn đến quá trình phát triển tính cách của cô. “T-Tớ cũng không rõ nữa… Ừm, đúng là bác Koyuki đã dạy tớ rất nhiều điều, nên xét ở góc độ đó thì có lẽ bọn tớ khá giống nhau… nhưng chuyện này cũng không thể chắc chắn được cho đến khi cậu tự mình tận mắt thấy…”</w:t>
       </w:r>
     </w:p>
     <w:p>
@@ -13593,20 +13593,20 @@
           <w:color w:val="222222"/>
           <w:sz w:val="24"/>
         </w:rPr>
-        <w:t>“A— Liệu tớ có nên, ừm, có lẽ, ch-chào hỏi cô Shihoko và chú Shuuto không nhỉ? Cậu là đứa con trai quý báu của họ, tự quyết định chuyện này mà không có sự chấp thuận của hai người thì thật không phải…”</w:t>
-      </w:r>
-    </w:p>
-    <w:p>
-      <w:pPr>
-        <w:spacing w:before="0" w:after="120" w:line="276" w:lineRule="auto"/>
-      </w:pPr>
-      <w:r>
-        <w:rPr>
-          <w:rFonts w:ascii="Montserrat" w:hAnsi="Montserrat"/>
-          <w:color w:val="222222"/>
-          <w:sz w:val="24"/>
-        </w:rPr>
-        <w:t>“Ừm, chà, cậu nói cũng có lý. Dù tớ nghĩ bố mẹ sẽ rất vui thôi. Nếu vậy thì, tớ cũng nên đến thưa chuyện với bà Koyuki nhỉ…?”</w:t>
+        <w:t>“A— Liệu tớ có nên, ừm, có lẽ, ch-chào hỏi cô Shihoko và bác Shuuto không nhỉ? Cậu là đứa con trai quý báu của họ, tự quyết định chuyện này mà không có sự chấp thuận của hai người thì thật không phải…”</w:t>
+      </w:r>
+    </w:p>
+    <w:p>
+      <w:pPr>
+        <w:spacing w:before="0" w:after="120" w:line="276" w:lineRule="auto"/>
+      </w:pPr>
+      <w:r>
+        <w:rPr>
+          <w:rFonts w:ascii="Montserrat" w:hAnsi="Montserrat"/>
+          <w:color w:val="222222"/>
+          <w:sz w:val="24"/>
+        </w:rPr>
+        <w:t>“Ừm, chà, cậu nói cũng có lý. Dù tớ nghĩ bố mẹ sẽ rất vui thôi. Nếu vậy thì, tớ cũng nên đến thưa chuyện với bác Koyuki nhỉ…?”</w:t>
       </w:r>
     </w:p>
     <w:p>
@@ -13632,7 +13632,7 @@
           <w:color w:val="222222"/>
           <w:sz w:val="24"/>
         </w:rPr>
-        <w:t>“Tớ chắc chắn là cô Koyuki đang lo sốt vó cho cậu đấy, và tớ có thể hình dung ra bà ấy sẽ bất an thế nào khi biết cậu đang sống cùng một đứa con trai mà bà ấy không hiểu rõ. Chắc là chúng ta nên đến chào hỏi bà ấy sớm thì hơn.”</w:t>
+        <w:t>“Tớ chắc chắn là bác Koyuki đang lo sốt vó cho cậu đấy, và tớ có thể hình dung ra bác ấy sẽ bất an thế nào khi biết cậu đang sống cùng một đứa con trai mà bác ấy không hiểu rõ. Chắc là chúng ta nên đến chào hỏi bác ấy sớm thì hơn.”</w:t>
       </w:r>
     </w:p>
     <w:p>
@@ -22172,7 +22172,7 @@
           <w:color w:val="222222"/>
           <w:sz w:val="24"/>
         </w:rPr>
-        <w:t>“Đã—Đã lâu không gặp, cô Koyuki…”</w:t>
+        <w:t>“Đã—Đã lâu không gặp, bác Koyuki…”</w:t>
       </w:r>
     </w:p>
     <w:p>
@@ -22211,7 +22211,7 @@
           <w:color w:val="222222"/>
           <w:sz w:val="24"/>
         </w:rPr>
-        <w:t>Mahiru cuối cùng cũng lau đi những giọt nước mắt lớn không ngừng tuôn rơi bằng chiếc khăn tay, và cố gắng nở một nụ cười rạng rỡ. Thấy vậy, nét mặt của cô Koyuki dịu lại thành một nụ cười nhẹ nhõm.</w:t>
+        <w:t>Mahiru cuối cùng cũng lau đi những giọt nước mắt lớn không ngừng tuôn rơi bằng chiếc khăn tay, và cố gắng nở một nụ cười rạng rỡ. Thấy vậy, nét mặt của bác Koyuki dịu lại thành một nụ cười nhẹ nhõm.</w:t>
       </w:r>
     </w:p>
     <w:p>
@@ -22237,7 +22237,7 @@
           <w:color w:val="222222"/>
           <w:sz w:val="24"/>
         </w:rPr>
-        <w:t>Khi còn nhỏ, Mahiru tuy mạnh mẽ nhưng cũng rất mong manh, không bao giờ chịu để lộ điểm yếu của mình, ngay cả với cô Koyuki. Cô hiếm khi rơi nước mắt, luôn kìm nén mọi thứ trong lòng và không thể dựa dẫm vào ai, dù cho bản thân có tổn thương đến nhường nào. Cô không còn cách nào khác ngoài việc tự mình gánh chịu tất cả. Nhưng giờ đây, Mahiru đã trút bỏ được lớp vỏ bọc cứng nhắc ấy. Cô đã trở nên dịu dàng hơn, cởi mở hơn, nhưng đồng thời, cô cũng đã trưởng thành, mạnh mẽ và kiên cường hơn.</w:t>
+        <w:t>Khi còn nhỏ, Mahiru tuy mạnh mẽ nhưng cũng rất mong manh, không bao giờ chịu để lộ điểm yếu của mình, ngay cả với bác Koyuki. Cô hiếm khi rơi nước mắt, luôn kìm nén mọi thứ trong lòng và không thể dựa dẫm vào ai, dù cho bản thân có tổn thương đến nhường nào. Cô không còn cách nào khác ngoài việc tự mình gánh chịu tất cả. Nhưng giờ đây, Mahiru đã trút bỏ được lớp vỏ bọc cứng nhắc ấy. Cô đã trở nên dịu dàng hơn, cởi mở hơn, nhưng đồng thời, cô cũng đã trưởng thành, mạnh mẽ và kiên cường hơn.</w:t>
       </w:r>
     </w:p>
     <w:p>

</xml_diff>